<commit_message>
build: regeneración completa del sitio web
- Renderizados todos los documentos (HTML, PDF, DOCX)
- Actualizados assets CSS y JS
- Optimizados archivos de búsqueda y sitemap
</commit_message>
<xml_diff>
--- a/_site/posts/2023-06-03-ideas-de-investigacion-para-economia/index.docx
+++ b/_site/posts/2023-06-03-ideas-de-investigacion-para-economia/index.docx
@@ -44,7 +44,7 @@
         <w:t xml:space="preserve"> </w:t>
       </w:r>
     </w:p>
-    <w:bookmarkStart w:id="20" w:name="title"/>
+    <w:bookmarkStart w:id="22" w:name="title"/>
     <w:p>
       <w:pPr>
         <w:pStyle w:val="Heading1"/>
@@ -93,8 +93,8 @@
         <w:t xml:space="preserve"> </w:t>
       </w:r>
     </w:p>
-    <w:bookmarkEnd w:id="20"/>
-    <w:bookmarkStart w:id="24" w:name="author-note"/>
+    <w:bookmarkEnd w:id="22"/>
+    <w:bookmarkStart w:id="26" w:name="author-note"/>
     <w:p>
       <w:pPr>
         <w:pStyle w:val="Heading1"/>
@@ -113,15 +113,15 @@
       <w:r>
         <w:t xml:space="preserve"> </w:t>
       </w:r>
-      <w:bookmarkStart w:id="21" w:name="orchid"/>
+      <w:bookmarkStart w:id="23" w:name="orchid"/>
       <w:r>
         <w:t xml:space="preserve">Orcid ID Logo: A green circle with white letters ID</w:t>
       </w:r>
-      <w:bookmarkEnd w:id="21"/>
+      <w:bookmarkEnd w:id="23"/>
       <w:r>
         <w:t xml:space="preserve"> </w:t>
       </w:r>
-      <w:hyperlink r:id="rId22">
+      <w:hyperlink r:id="rId24">
         <w:r>
           <w:rPr>
             <w:rStyle w:val="Hyperlink"/>
@@ -173,7 +173,7 @@
       <w:r>
         <w:t xml:space="preserve"> </w:t>
       </w:r>
-      <w:hyperlink r:id="rId23">
+      <w:hyperlink r:id="rId25">
         <w:r>
           <w:rPr>
             <w:rStyle w:val="Hyperlink"/>
@@ -187,8 +187,8 @@
         <w:br w:type="page"/>
       </w:r>
     </w:p>
-    <w:bookmarkEnd w:id="24"/>
-    <w:bookmarkStart w:id="25" w:name="abstract"/>
+    <w:bookmarkEnd w:id="26"/>
+    <w:bookmarkStart w:id="27" w:name="abstract"/>
     <w:p>
       <w:pPr>
         <w:pStyle w:val="Heading1"/>
@@ -225,8 +225,8 @@
         <w:br w:type="page"/>
       </w:r>
     </w:p>
-    <w:bookmarkEnd w:id="25"/>
-    <w:bookmarkStart w:id="26" w:name="firstheader"/>
+    <w:bookmarkEnd w:id="27"/>
+    <w:bookmarkStart w:id="28" w:name="firstheader"/>
     <w:p>
       <w:pPr>
         <w:pStyle w:val="Heading1"/>
@@ -243,8 +243,8 @@
         <w:t xml:space="preserve">En esta publicación presento algunos temas de investigación en economía</w:t>
       </w:r>
     </w:p>
-    <w:bookmarkEnd w:id="26"/>
-    <w:bookmarkStart w:id="34" w:name="X036c28f01fa52e29e4f87917c71e12b2c24f81f"/>
+    <w:bookmarkEnd w:id="28"/>
+    <w:bookmarkStart w:id="36" w:name="X036c28f01fa52e29e4f87917c71e12b2c24f81f"/>
     <w:p>
       <w:pPr>
         <w:pStyle w:val="Heading1"/>
@@ -253,7 +253,7 @@
         <w:t xml:space="preserve">1. Matriz 1: Gasto Público Social y Desarrollo Humano en Ayacucho</w:t>
       </w:r>
     </w:p>
-    <w:bookmarkStart w:id="27" w:name="título"/>
+    <w:bookmarkStart w:id="29" w:name="título"/>
     <w:p>
       <w:pPr>
         <w:pStyle w:val="Heading2"/>
@@ -274,8 +274,8 @@
         <w:t xml:space="preserve">Influencia del Gasto Público Social en el Desarrollo Humano en la Región de Ayacucho, Periodo 2008-2021</w:t>
       </w:r>
     </w:p>
-    <w:bookmarkEnd w:id="27"/>
-    <w:bookmarkStart w:id="28" w:name="datos-generales"/>
+    <w:bookmarkEnd w:id="29"/>
+    <w:bookmarkStart w:id="30" w:name="datos-generales"/>
     <w:p>
       <w:pPr>
         <w:pStyle w:val="Heading2"/>
@@ -657,8 +657,8 @@
         </w:tc>
       </w:tr>
     </w:tbl>
-    <w:bookmarkEnd w:id="28"/>
-    <w:bookmarkStart w:id="29" w:name="variables-e-indicadores"/>
+    <w:bookmarkEnd w:id="30"/>
+    <w:bookmarkStart w:id="31" w:name="variables-e-indicadores"/>
     <w:p>
       <w:pPr>
         <w:pStyle w:val="Heading2"/>
@@ -1104,8 +1104,8 @@
         </w:tc>
       </w:tr>
     </w:tbl>
-    <w:bookmarkEnd w:id="29"/>
-    <w:bookmarkStart w:id="30" w:name="metodología"/>
+    <w:bookmarkEnd w:id="31"/>
+    <w:bookmarkStart w:id="32" w:name="metodología"/>
     <w:p>
       <w:pPr>
         <w:pStyle w:val="Heading2"/>
@@ -1528,8 +1528,8 @@
         </w:tc>
       </w:tr>
     </w:tbl>
-    <w:bookmarkEnd w:id="30"/>
-    <w:bookmarkStart w:id="31" w:name="marco-teórico-conceptos-clave"/>
+    <w:bookmarkEnd w:id="32"/>
+    <w:bookmarkStart w:id="33" w:name="marco-teórico-conceptos-clave"/>
     <w:p>
       <w:pPr>
         <w:pStyle w:val="Heading2"/>
@@ -1592,8 +1592,8 @@
         <w:t xml:space="preserve">Medida compuesta que evalúa el promedio de los logros de un país o región en tres dimensiones básicas del desarrollo humano: salud, educación e ingresos.</w:t>
       </w:r>
     </w:p>
-    <w:bookmarkEnd w:id="31"/>
-    <w:bookmarkStart w:id="33" w:name="referencias-principales"/>
+    <w:bookmarkEnd w:id="33"/>
+    <w:bookmarkStart w:id="35" w:name="referencias-principales"/>
     <w:p>
       <w:pPr>
         <w:pStyle w:val="Heading2"/>
@@ -1629,7 +1629,7 @@
       <w:r>
         <w:t xml:space="preserve"> </w:t>
       </w:r>
-      <w:hyperlink r:id="rId32">
+      <w:hyperlink r:id="rId34">
         <w:r>
           <w:rPr>
             <w:rStyle w:val="Hyperlink"/>
@@ -1688,9 +1688,9 @@
         <w:t xml:space="preserve">. Lima: Ministerio de Economía y Finanzas.</w:t>
       </w:r>
     </w:p>
-    <w:bookmarkEnd w:id="33"/>
-    <w:bookmarkEnd w:id="34"/>
-    <w:bookmarkStart w:id="42" w:name="X6d3f29038f5640152e25b45c7f93416d0959398"/>
+    <w:bookmarkEnd w:id="35"/>
+    <w:bookmarkEnd w:id="36"/>
+    <w:bookmarkStart w:id="44" w:name="X6d3f29038f5640152e25b45c7f93416d0959398"/>
     <w:p>
       <w:pPr>
         <w:pStyle w:val="Heading1"/>
@@ -1699,7 +1699,7 @@
         <w:t xml:space="preserve">2. Matriz 2: Gasto Público y Desigualdad de Ingreso en Perú</w:t>
       </w:r>
     </w:p>
-    <w:bookmarkStart w:id="35" w:name="título-1"/>
+    <w:bookmarkStart w:id="37" w:name="título-1"/>
     <w:p>
       <w:pPr>
         <w:pStyle w:val="Heading2"/>
@@ -1720,8 +1720,8 @@
         <w:t xml:space="preserve">Influencia del Gasto Público en la Desigualdad de Ingreso en el Perú, Periodo 2000-2024</w:t>
       </w:r>
     </w:p>
-    <w:bookmarkEnd w:id="35"/>
-    <w:bookmarkStart w:id="36" w:name="datos-generales-1"/>
+    <w:bookmarkEnd w:id="37"/>
+    <w:bookmarkStart w:id="38" w:name="datos-generales-1"/>
     <w:p>
       <w:pPr>
         <w:pStyle w:val="Heading2"/>
@@ -2103,8 +2103,8 @@
         </w:tc>
       </w:tr>
     </w:tbl>
-    <w:bookmarkEnd w:id="36"/>
-    <w:bookmarkStart w:id="37" w:name="variables-e-indicadores-1"/>
+    <w:bookmarkEnd w:id="38"/>
+    <w:bookmarkStart w:id="39" w:name="variables-e-indicadores-1"/>
     <w:p>
       <w:pPr>
         <w:pStyle w:val="Heading2"/>
@@ -2553,8 +2553,8 @@
         </w:tc>
       </w:tr>
     </w:tbl>
-    <w:bookmarkEnd w:id="37"/>
-    <w:bookmarkStart w:id="38" w:name="metodología-1"/>
+    <w:bookmarkEnd w:id="39"/>
+    <w:bookmarkStart w:id="40" w:name="metodología-1"/>
     <w:p>
       <w:pPr>
         <w:pStyle w:val="Heading2"/>
@@ -2977,8 +2977,8 @@
         </w:tc>
       </w:tr>
     </w:tbl>
-    <w:bookmarkEnd w:id="38"/>
-    <w:bookmarkStart w:id="39" w:name="marco-teórico-conceptos-clave-1"/>
+    <w:bookmarkEnd w:id="40"/>
+    <w:bookmarkStart w:id="41" w:name="marco-teórico-conceptos-clave-1"/>
     <w:p>
       <w:pPr>
         <w:pStyle w:val="Heading2"/>
@@ -3041,8 +3041,8 @@
         <w:t xml:space="preserve">Programas de asistencia social que otorgan recursos monetarios a hogares pobres condicionados al cumplimiento de ciertos comportamientos (educación, salud).</w:t>
       </w:r>
     </w:p>
-    <w:bookmarkEnd w:id="39"/>
-    <w:bookmarkStart w:id="41" w:name="referencias-principales-1"/>
+    <w:bookmarkEnd w:id="41"/>
+    <w:bookmarkStart w:id="43" w:name="referencias-principales-1"/>
     <w:p>
       <w:pPr>
         <w:pStyle w:val="Heading2"/>
@@ -3078,7 +3078,7 @@
       <w:r>
         <w:t xml:space="preserve"> </w:t>
       </w:r>
-      <w:hyperlink r:id="rId40">
+      <w:hyperlink r:id="rId42">
         <w:r>
           <w:rPr>
             <w:rStyle w:val="Hyperlink"/>
@@ -3137,9 +3137,9 @@
         <w:t xml:space="preserve">. Lima: Instituto Nacional de Estadística e Informática.</w:t>
       </w:r>
     </w:p>
-    <w:bookmarkEnd w:id="41"/>
-    <w:bookmarkEnd w:id="42"/>
-    <w:bookmarkStart w:id="50" w:name="X3c8c6709ec8df23824cf40747bb70cd3358f0cc"/>
+    <w:bookmarkEnd w:id="43"/>
+    <w:bookmarkEnd w:id="44"/>
+    <w:bookmarkStart w:id="52" w:name="X3c8c6709ec8df23824cf40747bb70cd3358f0cc"/>
     <w:p>
       <w:pPr>
         <w:pStyle w:val="Heading1"/>
@@ -3148,7 +3148,7 @@
         <w:t xml:space="preserve">3. Matriz 3: Eficiencia del Gasto Público en Educación en Ayacucho</w:t>
       </w:r>
     </w:p>
-    <w:bookmarkStart w:id="43" w:name="título-2"/>
+    <w:bookmarkStart w:id="45" w:name="título-2"/>
     <w:p>
       <w:pPr>
         <w:pStyle w:val="Heading2"/>
@@ -3169,8 +3169,8 @@
         <w:t xml:space="preserve">Evaluación de la Eficiencia del Gasto Público en Educación en los Distritos de Ayacucho, Periodo 2015-2023</w:t>
       </w:r>
     </w:p>
-    <w:bookmarkEnd w:id="43"/>
-    <w:bookmarkStart w:id="44" w:name="datos-generales-2"/>
+    <w:bookmarkEnd w:id="45"/>
+    <w:bookmarkStart w:id="46" w:name="datos-generales-2"/>
     <w:p>
       <w:pPr>
         <w:pStyle w:val="Heading2"/>
@@ -3552,8 +3552,8 @@
         </w:tc>
       </w:tr>
     </w:tbl>
-    <w:bookmarkEnd w:id="44"/>
-    <w:bookmarkStart w:id="45" w:name="variables-e-indicadores-2"/>
+    <w:bookmarkEnd w:id="46"/>
+    <w:bookmarkStart w:id="47" w:name="variables-e-indicadores-2"/>
     <w:p>
       <w:pPr>
         <w:pStyle w:val="Heading2"/>
@@ -3999,8 +3999,8 @@
         </w:tc>
       </w:tr>
     </w:tbl>
-    <w:bookmarkEnd w:id="45"/>
-    <w:bookmarkStart w:id="46" w:name="metodología-2"/>
+    <w:bookmarkEnd w:id="47"/>
+    <w:bookmarkStart w:id="48" w:name="metodología-2"/>
     <w:p>
       <w:pPr>
         <w:pStyle w:val="Heading2"/>
@@ -4423,8 +4423,8 @@
         </w:tc>
       </w:tr>
     </w:tbl>
-    <w:bookmarkEnd w:id="46"/>
-    <w:bookmarkStart w:id="47" w:name="marco-teórico-conceptos-clave-2"/>
+    <w:bookmarkEnd w:id="48"/>
+    <w:bookmarkStart w:id="49" w:name="marco-teórico-conceptos-clave-2"/>
     <w:p>
       <w:pPr>
         <w:pStyle w:val="Heading2"/>
@@ -4487,8 +4487,8 @@
         <w:t xml:space="preserve">Evaluación estandarizada que aplica el MINEDU para medir logros de aprendizaje en comunicación y matemática.</w:t>
       </w:r>
     </w:p>
-    <w:bookmarkEnd w:id="47"/>
-    <w:bookmarkStart w:id="48" w:name="enfoque-metodológico-dea"/>
+    <w:bookmarkEnd w:id="49"/>
+    <w:bookmarkStart w:id="50" w:name="enfoque-metodológico-dea"/>
     <w:p>
       <w:pPr>
         <w:pStyle w:val="Heading2"/>
@@ -4619,8 +4619,8 @@
         <w:t xml:space="preserve">DEA-CRS (retornos constantes a escala) o DEA-VRS (retornos variables a escala)</w:t>
       </w:r>
     </w:p>
-    <w:bookmarkEnd w:id="48"/>
-    <w:bookmarkStart w:id="49" w:name="referencias-principales-2"/>
+    <w:bookmarkEnd w:id="50"/>
+    <w:bookmarkStart w:id="51" w:name="referencias-principales-2"/>
     <w:p>
       <w:pPr>
         <w:pStyle w:val="Heading2"/>
@@ -4704,9 +4704,9 @@
         <w:t xml:space="preserve">. Journal of Applied Economics, 8(2), 227-246.</w:t>
       </w:r>
     </w:p>
-    <w:bookmarkEnd w:id="49"/>
-    <w:bookmarkEnd w:id="50"/>
-    <w:bookmarkStart w:id="58" w:name="X07f43d7658f340463a7d4461bda9e000566410f"/>
+    <w:bookmarkEnd w:id="51"/>
+    <w:bookmarkEnd w:id="52"/>
+    <w:bookmarkStart w:id="60" w:name="X07f43d7658f340463a7d4461bda9e000566410f"/>
     <w:p>
       <w:pPr>
         <w:pStyle w:val="Heading1"/>
@@ -4715,7 +4715,7 @@
         <w:t xml:space="preserve">4. Matriz 4: Inversión Pública en Infraestructura Vial y Crecimiento Económico</w:t>
       </w:r>
     </w:p>
-    <w:bookmarkStart w:id="51" w:name="título-3"/>
+    <w:bookmarkStart w:id="53" w:name="título-3"/>
     <w:p>
       <w:pPr>
         <w:pStyle w:val="Heading2"/>
@@ -4736,8 +4736,8 @@
         <w:t xml:space="preserve">Efectos de la Inversión Pública en Infraestructura Vial en el Crecimiento Económico de los Distritos de Ayacucho, Periodo 2010-2023</w:t>
       </w:r>
     </w:p>
-    <w:bookmarkEnd w:id="51"/>
-    <w:bookmarkStart w:id="52" w:name="datos-generales-3"/>
+    <w:bookmarkEnd w:id="53"/>
+    <w:bookmarkStart w:id="54" w:name="datos-generales-3"/>
     <w:p>
       <w:pPr>
         <w:pStyle w:val="Heading2"/>
@@ -5119,8 +5119,8 @@
         </w:tc>
       </w:tr>
     </w:tbl>
-    <w:bookmarkEnd w:id="52"/>
-    <w:bookmarkStart w:id="53" w:name="variables-e-indicadores-3"/>
+    <w:bookmarkEnd w:id="54"/>
+    <w:bookmarkStart w:id="55" w:name="variables-e-indicadores-3"/>
     <w:p>
       <w:pPr>
         <w:pStyle w:val="Heading2"/>
@@ -5623,8 +5623,8 @@
         </w:tc>
       </w:tr>
     </w:tbl>
-    <w:bookmarkEnd w:id="53"/>
-    <w:bookmarkStart w:id="54" w:name="metodología-3"/>
+    <w:bookmarkEnd w:id="55"/>
+    <w:bookmarkStart w:id="56" w:name="metodología-3"/>
     <w:p>
       <w:pPr>
         <w:pStyle w:val="Heading2"/>
@@ -6053,8 +6053,8 @@
         </w:tc>
       </w:tr>
     </w:tbl>
-    <w:bookmarkEnd w:id="54"/>
-    <w:bookmarkStart w:id="55" w:name="marco-teórico-conceptos-clave-3"/>
+    <w:bookmarkEnd w:id="56"/>
+    <w:bookmarkStart w:id="57" w:name="marco-teórico-conceptos-clave-3"/>
     <w:p>
       <w:pPr>
         <w:pStyle w:val="Heading2"/>
@@ -6117,8 +6117,8 @@
         <w:t xml:space="preserve">Grado de integración física y funcional de un territorio con centros económicos, determinado por la calidad y accesibilidad de la red vial.</w:t>
       </w:r>
     </w:p>
-    <w:bookmarkEnd w:id="55"/>
-    <w:bookmarkStart w:id="56" w:name="modelo-econométrico-propuesto"/>
+    <w:bookmarkEnd w:id="57"/>
+    <w:bookmarkStart w:id="58" w:name="modelo-econométrico-propuesto"/>
     <w:p>
       <w:pPr>
         <w:pStyle w:val="Heading2"/>
@@ -6154,37 +6154,39 @@
           <m:r>
             <m:t>n</m:t>
           </m:r>
-          <m:d>
-            <m:dPr>
-              <m:begChr m:val="("/>
-              <m:sepChr m:val=""/>
-              <m:endChr m:val=")"/>
-              <m:grow/>
-            </m:dPr>
+          <m:r>
+            <m:rPr>
+              <m:sty m:val="p"/>
+            </m:rPr>
+            <m:t>(</m:t>
+          </m:r>
+          <m:r>
+            <m:t>P</m:t>
+          </m:r>
+          <m:r>
+            <m:t>B</m:t>
+          </m:r>
+          <m:sSub>
             <m:e>
               <m:r>
-                <m:t>P</m:t>
-              </m:r>
-              <m:r>
-                <m:t>B</m:t>
-              </m:r>
-              <m:sSub>
-                <m:e>
-                  <m:r>
-                    <m:t>I</m:t>
-                  </m:r>
-                </m:e>
-                <m:sub>
-                  <m:r>
-                    <m:t>i</m:t>
-                  </m:r>
-                </m:sub>
-              </m:sSub>
-              <m:r>
-                <m:t>t</m:t>
+                <m:t>I</m:t>
               </m:r>
             </m:e>
-          </m:d>
+            <m:sub>
+              <m:r>
+                <m:t>i</m:t>
+              </m:r>
+            </m:sub>
+          </m:sSub>
+          <m:r>
+            <m:t>t</m:t>
+          </m:r>
+          <m:r>
+            <m:rPr>
+              <m:sty m:val="p"/>
+            </m:rPr>
+            <m:t>)</m:t>
+          </m:r>
           <m:r>
             <m:rPr>
               <m:sty m:val="p"/>
@@ -6227,49 +6229,51 @@
           <m:r>
             <m:t>n</m:t>
           </m:r>
-          <m:d>
-            <m:dPr>
-              <m:begChr m:val="("/>
-              <m:sepChr m:val=""/>
-              <m:endChr m:val=")"/>
-              <m:grow/>
-            </m:dPr>
+          <m:r>
+            <m:rPr>
+              <m:sty m:val="p"/>
+            </m:rPr>
+            <m:t>(</m:t>
+          </m:r>
+          <m:r>
+            <m:t>I</m:t>
+          </m:r>
+          <m:r>
+            <m:t>n</m:t>
+          </m:r>
+          <m:r>
+            <m:t>v</m:t>
+          </m:r>
+          <m:r>
+            <m:t>V</m:t>
+          </m:r>
+          <m:r>
+            <m:t>i</m:t>
+          </m:r>
+          <m:r>
+            <m:t>a</m:t>
+          </m:r>
+          <m:sSub>
             <m:e>
               <m:r>
-                <m:t>I</m:t>
+                <m:t>l</m:t>
               </m:r>
-              <m:r>
-                <m:t>n</m:t>
-              </m:r>
-              <m:r>
-                <m:t>v</m:t>
-              </m:r>
-              <m:r>
-                <m:t>V</m:t>
-              </m:r>
+            </m:e>
+            <m:sub>
               <m:r>
                 <m:t>i</m:t>
               </m:r>
-              <m:r>
-                <m:t>a</m:t>
-              </m:r>
-              <m:sSub>
-                <m:e>
-                  <m:r>
-                    <m:t>l</m:t>
-                  </m:r>
-                </m:e>
-                <m:sub>
-                  <m:r>
-                    <m:t>i</m:t>
-                  </m:r>
-                </m:sub>
-              </m:sSub>
-              <m:r>
-                <m:t>t</m:t>
-              </m:r>
-            </m:e>
-          </m:d>
+            </m:sub>
+          </m:sSub>
+          <m:r>
+            <m:t>t</m:t>
+          </m:r>
+          <m:r>
+            <m:rPr>
+              <m:sty m:val="p"/>
+            </m:rPr>
+            <m:t>)</m:t>
+          </m:r>
           <m:r>
             <m:rPr>
               <m:sty m:val="p"/>
@@ -6446,8 +6450,8 @@
         <w:t xml:space="preserve">ε_it: Término de error</w:t>
       </w:r>
     </w:p>
-    <w:bookmarkEnd w:id="56"/>
-    <w:bookmarkStart w:id="57" w:name="referencias-principales-3"/>
+    <w:bookmarkEnd w:id="58"/>
+    <w:bookmarkStart w:id="59" w:name="referencias-principales-3"/>
     <w:p>
       <w:pPr>
         <w:pStyle w:val="Heading2"/>
@@ -6531,9 +6535,9 @@
         <w:t xml:space="preserve">. Washington DC: Banco Mundial.</w:t>
       </w:r>
     </w:p>
-    <w:bookmarkEnd w:id="57"/>
-    <w:bookmarkEnd w:id="58"/>
-    <w:bookmarkStart w:id="67" w:name="X96499088d3975a2ad40aa3fae2e994cdc4e1464"/>
+    <w:bookmarkEnd w:id="59"/>
+    <w:bookmarkEnd w:id="60"/>
+    <w:bookmarkStart w:id="69" w:name="X96499088d3975a2ad40aa3fae2e994cdc4e1464"/>
     <w:p>
       <w:pPr>
         <w:pStyle w:val="Heading1"/>
@@ -6542,7 +6546,7 @@
         <w:t xml:space="preserve">5. Matriz 5: Inversión Pública y Crecimiento Económico - Series de Tiempo</w:t>
       </w:r>
     </w:p>
-    <w:bookmarkStart w:id="59" w:name="título-4"/>
+    <w:bookmarkStart w:id="61" w:name="título-4"/>
     <w:p>
       <w:pPr>
         <w:pStyle w:val="Heading2"/>
@@ -6563,8 +6567,8 @@
         <w:t xml:space="preserve">Inversión Pública y el Crecimiento Económico en Ayacucho: Un Análisis de Series de Tiempo, Periodo 2000-2023</w:t>
       </w:r>
     </w:p>
-    <w:bookmarkEnd w:id="59"/>
-    <w:bookmarkStart w:id="60" w:name="datos-generales-4"/>
+    <w:bookmarkEnd w:id="61"/>
+    <w:bookmarkStart w:id="62" w:name="datos-generales-4"/>
     <w:p>
       <w:pPr>
         <w:pStyle w:val="Heading2"/>
@@ -6946,8 +6950,8 @@
         </w:tc>
       </w:tr>
     </w:tbl>
-    <w:bookmarkEnd w:id="60"/>
-    <w:bookmarkStart w:id="61" w:name="variables-e-indicadores-4"/>
+    <w:bookmarkEnd w:id="62"/>
+    <w:bookmarkStart w:id="63" w:name="variables-e-indicadores-4"/>
     <w:p>
       <w:pPr>
         <w:pStyle w:val="Heading2"/>
@@ -7484,8 +7488,8 @@
         </w:tc>
       </w:tr>
     </w:tbl>
-    <w:bookmarkEnd w:id="61"/>
-    <w:bookmarkStart w:id="62" w:name="metodología-4"/>
+    <w:bookmarkEnd w:id="63"/>
+    <w:bookmarkStart w:id="64" w:name="metodología-4"/>
     <w:p>
       <w:pPr>
         <w:pStyle w:val="Heading2"/>
@@ -7905,8 +7909,8 @@
         </w:tc>
       </w:tr>
     </w:tbl>
-    <w:bookmarkEnd w:id="62"/>
-    <w:bookmarkStart w:id="63" w:name="marco-teórico-conceptos-clave-4"/>
+    <w:bookmarkEnd w:id="64"/>
+    <w:bookmarkStart w:id="65" w:name="marco-teórico-conceptos-clave-4"/>
     <w:p>
       <w:pPr>
         <w:pStyle w:val="Heading2"/>
@@ -7987,8 +7991,8 @@
         <w:t xml:space="preserve">Prueba estadística que determina si una serie temporal ayuda a predecir otra, indicando precedencia temporal pero no causalidad en sentido estricto.</w:t>
       </w:r>
     </w:p>
-    <w:bookmarkEnd w:id="63"/>
-    <w:bookmarkStart w:id="64" w:name="estrategia-econométrica"/>
+    <w:bookmarkEnd w:id="65"/>
+    <w:bookmarkStart w:id="66" w:name="estrategia-econométrica"/>
     <w:p>
       <w:pPr>
         <w:pStyle w:val="Heading2"/>
@@ -8177,8 +8181,8 @@
         <w:t xml:space="preserve">Descomposición de varianza</w:t>
       </w:r>
     </w:p>
-    <w:bookmarkEnd w:id="64"/>
-    <w:bookmarkStart w:id="65" w:name="modelo-econométrico-propuesto-1"/>
+    <w:bookmarkEnd w:id="66"/>
+    <w:bookmarkStart w:id="67" w:name="modelo-econométrico-propuesto-1"/>
     <w:p>
       <w:pPr>
         <w:pStyle w:val="Heading2"/>
@@ -8209,6 +8213,9 @@
         </m:oMathParaPr>
         <m:oMath>
           <m:r>
+            <m:rPr>
+              <m:sty m:val="p"/>
+            </m:rPr>
             <m:t>Δ</m:t>
           </m:r>
           <m:sSub>
@@ -8232,35 +8239,22 @@
           <m:r>
             <m:t>α</m:t>
           </m:r>
-          <m:d>
-            <m:dPr>
-              <m:begChr m:val="("/>
-              <m:sepChr m:val=""/>
-              <m:endChr m:val=")"/>
-              <m:grow/>
-            </m:dPr>
+          <m:r>
+            <m:rPr>
+              <m:sty m:val="p"/>
+            </m:rPr>
+            <m:t>(</m:t>
+          </m:r>
+          <m:sSub>
             <m:e>
-              <m:sSub>
-                <m:e>
-                  <m:r>
-                    <m:t>Y</m:t>
-                  </m:r>
-                </m:e>
-                <m:sub>
-                  <m:r>
-                    <m:t>t</m:t>
-                  </m:r>
-                  <m:r>
-                    <m:rPr>
-                      <m:sty m:val="p"/>
-                    </m:rPr>
-                    <m:t>−</m:t>
-                  </m:r>
-                  <m:r>
-                    <m:t>1</m:t>
-                  </m:r>
-                </m:sub>
-              </m:sSub>
+              <m:r>
+                <m:t>Y</m:t>
+              </m:r>
+            </m:e>
+            <m:sub>
+              <m:r>
+                <m:t>t</m:t>
+              </m:r>
               <m:r>
                 <m:rPr>
                   <m:sty m:val="p"/>
@@ -8268,31 +8262,46 @@
                 <m:t>−</m:t>
               </m:r>
               <m:r>
-                <m:t>β</m:t>
+                <m:t>1</m:t>
               </m:r>
-              <m:sSub>
-                <m:e>
-                  <m:r>
-                    <m:t>X</m:t>
-                  </m:r>
-                </m:e>
-                <m:sub>
-                  <m:r>
-                    <m:t>t</m:t>
-                  </m:r>
-                  <m:r>
-                    <m:rPr>
-                      <m:sty m:val="p"/>
-                    </m:rPr>
-                    <m:t>−</m:t>
-                  </m:r>
-                  <m:r>
-                    <m:t>1</m:t>
-                  </m:r>
-                </m:sub>
-              </m:sSub>
+            </m:sub>
+          </m:sSub>
+          <m:r>
+            <m:rPr>
+              <m:sty m:val="p"/>
+            </m:rPr>
+            <m:t>−</m:t>
+          </m:r>
+          <m:r>
+            <m:t>β</m:t>
+          </m:r>
+          <m:sSub>
+            <m:e>
+              <m:r>
+                <m:t>X</m:t>
+              </m:r>
             </m:e>
-          </m:d>
+            <m:sub>
+              <m:r>
+                <m:t>t</m:t>
+              </m:r>
+              <m:r>
+                <m:rPr>
+                  <m:sty m:val="p"/>
+                </m:rPr>
+                <m:t>−</m:t>
+              </m:r>
+              <m:r>
+                <m:t>1</m:t>
+              </m:r>
+            </m:sub>
+          </m:sSub>
+          <m:r>
+            <m:rPr>
+              <m:sty m:val="p"/>
+            </m:rPr>
+            <m:t>)</m:t>
+          </m:r>
           <m:r>
             <m:rPr>
               <m:sty m:val="p"/>
@@ -8300,6 +8309,9 @@
             <m:t>+</m:t>
           </m:r>
           <m:r>
+            <m:rPr>
+              <m:sty m:val="p"/>
+            </m:rPr>
             <m:t>Σ</m:t>
           </m:r>
           <m:sSub>
@@ -8315,6 +8327,9 @@
             </m:sub>
           </m:sSub>
           <m:r>
+            <m:rPr>
+              <m:sty m:val="p"/>
+            </m:rPr>
             <m:t>Δ</m:t>
           </m:r>
           <m:sSub>
@@ -8345,6 +8360,9 @@
             <m:t>+</m:t>
           </m:r>
           <m:r>
+            <m:rPr>
+              <m:sty m:val="p"/>
+            </m:rPr>
             <m:t>Σ</m:t>
           </m:r>
           <m:sSub>
@@ -8360,6 +8378,9 @@
             </m:sub>
           </m:sSub>
           <m:r>
+            <m:rPr>
+              <m:sty m:val="p"/>
+            </m:rPr>
             <m:t>Δ</m:t>
           </m:r>
           <m:sSub>
@@ -8521,6 +8542,9 @@
             <m:t>+</m:t>
           </m:r>
           <m:r>
+            <m:rPr>
+              <m:sty m:val="p"/>
+            </m:rPr>
             <m:t>Σ</m:t>
           </m:r>
           <m:sSub>
@@ -8591,8 +8615,8 @@
         <w:t xml:space="preserve">Donde Y_t es un vector que incluye PBI e inversión pública.</w:t>
       </w:r>
     </w:p>
-    <w:bookmarkEnd w:id="65"/>
-    <w:bookmarkStart w:id="66" w:name="referencias-principales-4"/>
+    <w:bookmarkEnd w:id="67"/>
+    <w:bookmarkStart w:id="68" w:name="referencias-principales-4"/>
     <w:p>
       <w:pPr>
         <w:pStyle w:val="Heading2"/>
@@ -8682,9 +8706,9 @@
         <w:t xml:space="preserve">(4th ed.). Wiley.</w:t>
       </w:r>
     </w:p>
-    <w:bookmarkEnd w:id="66"/>
-    <w:bookmarkEnd w:id="67"/>
-    <w:bookmarkStart w:id="75" w:name="Xe1cbdbfbcf4fbde01969aae6ef61130cafe48cb"/>
+    <w:bookmarkEnd w:id="68"/>
+    <w:bookmarkEnd w:id="69"/>
+    <w:bookmarkStart w:id="77" w:name="Xe1cbdbfbcf4fbde01969aae6ef61130cafe48cb"/>
     <w:p>
       <w:pPr>
         <w:pStyle w:val="Heading1"/>
@@ -8693,7 +8717,7 @@
         <w:t xml:space="preserve">6. Matriz 6: Gestión Pública y Desarrollo Sostenible</w:t>
       </w:r>
     </w:p>
-    <w:bookmarkStart w:id="68" w:name="título-5"/>
+    <w:bookmarkStart w:id="70" w:name="título-5"/>
     <w:p>
       <w:pPr>
         <w:pStyle w:val="Heading2"/>
@@ -8714,8 +8738,8 @@
         <w:t xml:space="preserve">La Gestión Pública y su Incidencia en el Desarrollo Sostenible del Distrito de Santo Tomás, Chumbivilcas, Periodo 2020-2023</w:t>
       </w:r>
     </w:p>
-    <w:bookmarkEnd w:id="68"/>
-    <w:bookmarkStart w:id="69" w:name="datos-generales-5"/>
+    <w:bookmarkEnd w:id="70"/>
+    <w:bookmarkStart w:id="71" w:name="datos-generales-5"/>
     <w:p>
       <w:pPr>
         <w:pStyle w:val="Heading2"/>
@@ -9097,8 +9121,8 @@
         </w:tc>
       </w:tr>
     </w:tbl>
-    <w:bookmarkEnd w:id="69"/>
-    <w:bookmarkStart w:id="70" w:name="variables-e-indicadores-5"/>
+    <w:bookmarkEnd w:id="71"/>
+    <w:bookmarkStart w:id="72" w:name="variables-e-indicadores-5"/>
     <w:p>
       <w:pPr>
         <w:pStyle w:val="Heading2"/>
@@ -9631,8 +9655,8 @@
         </w:tc>
       </w:tr>
     </w:tbl>
-    <w:bookmarkEnd w:id="70"/>
-    <w:bookmarkStart w:id="71" w:name="metodología-5"/>
+    <w:bookmarkEnd w:id="72"/>
+    <w:bookmarkStart w:id="73" w:name="metodología-5"/>
     <w:p>
       <w:pPr>
         <w:pStyle w:val="Heading2"/>
@@ -10076,8 +10100,8 @@
         </w:tc>
       </w:tr>
     </w:tbl>
-    <w:bookmarkEnd w:id="71"/>
-    <w:bookmarkStart w:id="72" w:name="marco-teórico-conceptos-clave-5"/>
+    <w:bookmarkEnd w:id="73"/>
+    <w:bookmarkStart w:id="74" w:name="marco-teórico-conceptos-clave-5"/>
     <w:p>
       <w:pPr>
         <w:pStyle w:val="Heading2"/>
@@ -10140,8 +10164,8 @@
         <w:t xml:space="preserve">Conjunto de 17 objetivos globales establecidos por las Naciones Unidas en 2015 para erradicar la pobreza, proteger el planeta y asegurar prosperidad para todos.</w:t>
       </w:r>
     </w:p>
-    <w:bookmarkEnd w:id="72"/>
-    <w:bookmarkStart w:id="73" w:name="validación-de-instrumentos"/>
+    <w:bookmarkEnd w:id="74"/>
+    <w:bookmarkStart w:id="75" w:name="validación-de-instrumentos"/>
     <w:p>
       <w:pPr>
         <w:pStyle w:val="Heading2"/>
@@ -10216,8 +10240,8 @@
         <w:t xml:space="preserve">Aplicación a muestra pequeña (n=30) para ajustar instrumentos</w:t>
       </w:r>
     </w:p>
-    <w:bookmarkEnd w:id="73"/>
-    <w:bookmarkStart w:id="74" w:name="referencias-principales-5"/>
+    <w:bookmarkEnd w:id="75"/>
+    <w:bookmarkStart w:id="76" w:name="referencias-principales-5"/>
     <w:p>
       <w:pPr>
         <w:pStyle w:val="Heading2"/>
@@ -10301,9 +10325,9 @@
         <w:t xml:space="preserve">. Lima: PCM.</w:t>
       </w:r>
     </w:p>
-    <w:bookmarkEnd w:id="74"/>
-    <w:bookmarkEnd w:id="75"/>
-    <w:bookmarkStart w:id="84" w:name="X04a2be7feab5a81eb87098f375699966e5f92d7"/>
+    <w:bookmarkEnd w:id="76"/>
+    <w:bookmarkEnd w:id="77"/>
+    <w:bookmarkStart w:id="86" w:name="X04a2be7feab5a81eb87098f375699966e5f92d7"/>
     <w:p>
       <w:pPr>
         <w:pStyle w:val="Heading1"/>
@@ -10312,7 +10336,7 @@
         <w:t xml:space="preserve">7. Matriz 7: Presupuesto Participativo y Ejecución Presupuestaria</w:t>
       </w:r>
     </w:p>
-    <w:bookmarkStart w:id="76" w:name="título-6"/>
+    <w:bookmarkStart w:id="78" w:name="título-6"/>
     <w:p>
       <w:pPr>
         <w:pStyle w:val="Heading2"/>
@@ -10333,8 +10357,8 @@
         <w:t xml:space="preserve">El Presupuesto Participativo y su Relación con la Ejecución Presupuestaria en la Municipalidad Distrital de San Jerónimo, Cusco, Periodo 2024</w:t>
       </w:r>
     </w:p>
-    <w:bookmarkEnd w:id="76"/>
-    <w:bookmarkStart w:id="77" w:name="datos-generales-6"/>
+    <w:bookmarkEnd w:id="78"/>
+    <w:bookmarkStart w:id="79" w:name="datos-generales-6"/>
     <w:p>
       <w:pPr>
         <w:pStyle w:val="Heading2"/>
@@ -10716,8 +10740,8 @@
         </w:tc>
       </w:tr>
     </w:tbl>
-    <w:bookmarkEnd w:id="77"/>
-    <w:bookmarkStart w:id="78" w:name="variables-e-indicadores-6"/>
+    <w:bookmarkEnd w:id="79"/>
+    <w:bookmarkStart w:id="80" w:name="variables-e-indicadores-6"/>
     <w:p>
       <w:pPr>
         <w:pStyle w:val="Heading2"/>
@@ -11181,8 +11205,8 @@
         </w:tc>
       </w:tr>
     </w:tbl>
-    <w:bookmarkEnd w:id="78"/>
-    <w:bookmarkStart w:id="79" w:name="metodología-6"/>
+    <w:bookmarkEnd w:id="80"/>
+    <w:bookmarkStart w:id="81" w:name="metodología-6"/>
     <w:p>
       <w:pPr>
         <w:pStyle w:val="Heading2"/>
@@ -11614,8 +11638,8 @@
         </w:tc>
       </w:tr>
     </w:tbl>
-    <w:bookmarkEnd w:id="79"/>
-    <w:bookmarkStart w:id="80" w:name="marco-teórico-conceptos-clave-6"/>
+    <w:bookmarkEnd w:id="81"/>
+    <w:bookmarkStart w:id="82" w:name="marco-teórico-conceptos-clave-6"/>
     <w:p>
       <w:pPr>
         <w:pStyle w:val="Heading2"/>
@@ -11678,8 +11702,8 @@
         <w:t xml:space="preserve">Ley N° 28056 (Ley Marco del Presupuesto Participativo), Decreto Supremo N° 097-2009-EF (Reglamento), Ley N° 27972 (Ley Orgánica de Municipalidades).</w:t>
       </w:r>
     </w:p>
-    <w:bookmarkEnd w:id="80"/>
-    <w:bookmarkStart w:id="81" w:name="validación-de-instrumentos-1"/>
+    <w:bookmarkEnd w:id="82"/>
+    <w:bookmarkStart w:id="83" w:name="validación-de-instrumentos-1"/>
     <w:p>
       <w:pPr>
         <w:pStyle w:val="Heading2"/>
@@ -11754,8 +11778,8 @@
         <w:t xml:space="preserve">n=20 (no incluidos en la muestra final)</w:t>
       </w:r>
     </w:p>
-    <w:bookmarkEnd w:id="81"/>
-    <w:bookmarkStart w:id="82" w:name="esquema-de-correlación-esperada"/>
+    <w:bookmarkEnd w:id="83"/>
+    <w:bookmarkStart w:id="84" w:name="esquema-de-correlación-esperada"/>
     <w:p>
       <w:pPr>
         <w:pStyle w:val="Heading2"/>
@@ -11796,8 +11820,8 @@
         <w:t xml:space="preserve">Significancia estadística (p &lt; 0.05)</w:t>
       </w:r>
     </w:p>
-    <w:bookmarkEnd w:id="82"/>
-    <w:bookmarkStart w:id="83" w:name="referencias-principales-6"/>
+    <w:bookmarkEnd w:id="84"/>
+    <w:bookmarkStart w:id="85" w:name="referencias-principales-6"/>
     <w:p>
       <w:pPr>
         <w:pStyle w:val="Heading2"/>
@@ -11909,9 +11933,9 @@
         <w:t xml:space="preserve">. Environment and Urbanization, 16(1), 27-46.</w:t>
       </w:r>
     </w:p>
-    <w:bookmarkEnd w:id="83"/>
-    <w:bookmarkEnd w:id="84"/>
-    <w:bookmarkStart w:id="93" w:name="X490710c753d7dacd16b37c75718eab6bd81d659"/>
+    <w:bookmarkEnd w:id="85"/>
+    <w:bookmarkEnd w:id="86"/>
+    <w:bookmarkStart w:id="95" w:name="X490710c753d7dacd16b37c75718eab6bd81d659"/>
     <w:p>
       <w:pPr>
         <w:pStyle w:val="Heading1"/>
@@ -11920,7 +11944,7 @@
         <w:t xml:space="preserve">8. Matriz 8: Políticas Públicas y Reducción de Pobreza Rural</w:t>
       </w:r>
     </w:p>
-    <w:bookmarkStart w:id="85" w:name="título-7"/>
+    <w:bookmarkStart w:id="87" w:name="título-7"/>
     <w:p>
       <w:pPr>
         <w:pStyle w:val="Heading2"/>
@@ -11941,8 +11965,8 @@
         <w:t xml:space="preserve">Impacto de las Políticas Públicas en la Reducción de la Pobreza Rural en la Región de Ayacucho, Periodo 2010-2023</w:t>
       </w:r>
     </w:p>
-    <w:bookmarkEnd w:id="85"/>
-    <w:bookmarkStart w:id="86" w:name="datos-generales-7"/>
+    <w:bookmarkEnd w:id="87"/>
+    <w:bookmarkStart w:id="88" w:name="datos-generales-7"/>
     <w:p>
       <w:pPr>
         <w:pStyle w:val="Heading2"/>
@@ -12324,8 +12348,8 @@
         </w:tc>
       </w:tr>
     </w:tbl>
-    <w:bookmarkEnd w:id="86"/>
-    <w:bookmarkStart w:id="87" w:name="variables-e-indicadores-7"/>
+    <w:bookmarkEnd w:id="88"/>
+    <w:bookmarkStart w:id="89" w:name="variables-e-indicadores-7"/>
     <w:p>
       <w:pPr>
         <w:pStyle w:val="Heading2"/>
@@ -12843,8 +12867,8 @@
         </w:tc>
       </w:tr>
     </w:tbl>
-    <w:bookmarkEnd w:id="87"/>
-    <w:bookmarkStart w:id="88" w:name="metodología-7"/>
+    <w:bookmarkEnd w:id="89"/>
+    <w:bookmarkStart w:id="90" w:name="metodología-7"/>
     <w:p>
       <w:pPr>
         <w:pStyle w:val="Heading2"/>
@@ -13323,8 +13347,8 @@
         </w:tc>
       </w:tr>
     </w:tbl>
-    <w:bookmarkEnd w:id="88"/>
-    <w:bookmarkStart w:id="89" w:name="marco-teórico-conceptos-clave-7"/>
+    <w:bookmarkEnd w:id="90"/>
+    <w:bookmarkStart w:id="91" w:name="marco-teórico-conceptos-clave-7"/>
     <w:p>
       <w:pPr>
         <w:pStyle w:val="Heading2"/>
@@ -13387,8 +13411,8 @@
         <w:t xml:space="preserve">Programa del FONCODES orientado a mejorar la seguridad alimentaria y los ingresos económicos de hogares rurales en pobreza mediante asistencia técnica, transferencia de activos productivos y fortalecimiento de capacidades.</w:t>
       </w:r>
     </w:p>
-    <w:bookmarkEnd w:id="89"/>
-    <w:bookmarkStart w:id="90" w:name="estrategia-de-evaluación-de-impacto"/>
+    <w:bookmarkEnd w:id="91"/>
+    <w:bookmarkStart w:id="92" w:name="estrategia-de-evaluación-de-impacto"/>
     <w:p>
       <w:pPr>
         <w:pStyle w:val="Heading2"/>
@@ -13517,8 +13541,8 @@
         <w:t xml:space="preserve">Average Treatment Effect on the Treated (ATT)</w:t>
       </w:r>
     </w:p>
-    <w:bookmarkEnd w:id="90"/>
-    <w:bookmarkStart w:id="91" w:name="componente-cualitativo"/>
+    <w:bookmarkEnd w:id="92"/>
+    <w:bookmarkStart w:id="93" w:name="componente-cualitativo"/>
     <w:p>
       <w:pPr>
         <w:pStyle w:val="Heading2"/>
@@ -13593,8 +13617,8 @@
         <w:t xml:space="preserve">Historias de vida</w:t>
       </w:r>
     </w:p>
-    <w:bookmarkEnd w:id="91"/>
-    <w:bookmarkStart w:id="92" w:name="referencias-principales-7"/>
+    <w:bookmarkEnd w:id="93"/>
+    <w:bookmarkStart w:id="94" w:name="referencias-principales-7"/>
     <w:p>
       <w:pPr>
         <w:pStyle w:val="Heading2"/>
@@ -13678,9 +13702,9 @@
         <w:t xml:space="preserve">. Lima: Ministerio de Desarrollo e Inclusión Social.</w:t>
       </w:r>
     </w:p>
-    <w:bookmarkEnd w:id="92"/>
-    <w:bookmarkEnd w:id="93"/>
-    <w:bookmarkStart w:id="101" w:name="Xf612f513c93d5860e8f0c2f3e51152e67bbdf62"/>
+    <w:bookmarkEnd w:id="94"/>
+    <w:bookmarkEnd w:id="95"/>
+    <w:bookmarkStart w:id="103" w:name="Xf612f513c93d5860e8f0c2f3e51152e67bbdf62"/>
     <w:p>
       <w:pPr>
         <w:pStyle w:val="Heading1"/>
@@ -13689,7 +13713,7 @@
         <w:t xml:space="preserve">9. Matriz 9: Modernización de la Gestión Pública y Gasto Público</w:t>
       </w:r>
     </w:p>
-    <w:bookmarkStart w:id="94" w:name="título-8"/>
+    <w:bookmarkStart w:id="96" w:name="título-8"/>
     <w:p>
       <w:pPr>
         <w:pStyle w:val="Heading2"/>
@@ -13710,8 +13734,8 @@
         <w:t xml:space="preserve">Modernización de la Gestión Pública y su Relación con el Gasto Público en la Municipalidad Distrital de Pillco Marca, Huánuco, Periodo 2021</w:t>
       </w:r>
     </w:p>
-    <w:bookmarkEnd w:id="94"/>
-    <w:bookmarkStart w:id="95" w:name="datos-generales-8"/>
+    <w:bookmarkEnd w:id="96"/>
+    <w:bookmarkStart w:id="97" w:name="datos-generales-8"/>
     <w:p>
       <w:pPr>
         <w:pStyle w:val="Heading2"/>
@@ -14093,8 +14117,8 @@
         </w:tc>
       </w:tr>
     </w:tbl>
-    <w:bookmarkEnd w:id="95"/>
-    <w:bookmarkStart w:id="96" w:name="variables-e-indicadores-8"/>
+    <w:bookmarkEnd w:id="97"/>
+    <w:bookmarkStart w:id="98" w:name="variables-e-indicadores-8"/>
     <w:p>
       <w:pPr>
         <w:pStyle w:val="Heading2"/>
@@ -14618,8 +14642,8 @@
         </w:tc>
       </w:tr>
     </w:tbl>
-    <w:bookmarkEnd w:id="96"/>
-    <w:bookmarkStart w:id="97" w:name="metodología-8"/>
+    <w:bookmarkEnd w:id="98"/>
+    <w:bookmarkStart w:id="99" w:name="metodología-8"/>
     <w:p>
       <w:pPr>
         <w:pStyle w:val="Heading2"/>
@@ -15051,8 +15075,8 @@
         </w:tc>
       </w:tr>
     </w:tbl>
-    <w:bookmarkEnd w:id="97"/>
-    <w:bookmarkStart w:id="98" w:name="marco-teórico-conceptos-clave-8"/>
+    <w:bookmarkEnd w:id="99"/>
+    <w:bookmarkStart w:id="100" w:name="marco-teórico-conceptos-clave-8"/>
     <w:p>
       <w:pPr>
         <w:pStyle w:val="Heading2"/>
@@ -15115,8 +15139,8 @@
         <w:t xml:space="preserve">Conjunto de erogaciones realizadas por el Estado en el cumplimiento de sus funciones, clasificado en gasto corriente (operativo) y gasto de capital (inversión).</w:t>
       </w:r>
     </w:p>
-    <w:bookmarkEnd w:id="98"/>
-    <w:bookmarkStart w:id="99" w:name="validación-de-instrumentos-2"/>
+    <w:bookmarkEnd w:id="100"/>
+    <w:bookmarkStart w:id="101" w:name="validación-de-instrumentos-2"/>
     <w:p>
       <w:pPr>
         <w:pStyle w:val="Heading2"/>
@@ -15191,8 +15215,8 @@
         <w:t xml:space="preserve">n=30</w:t>
       </w:r>
     </w:p>
-    <w:bookmarkEnd w:id="99"/>
-    <w:bookmarkStart w:id="100" w:name="referencias-principales-8"/>
+    <w:bookmarkEnd w:id="101"/>
+    <w:bookmarkStart w:id="102" w:name="referencias-principales-8"/>
     <w:p>
       <w:pPr>
         <w:pStyle w:val="Heading2"/>
@@ -15276,9 +15300,9 @@
         <w:t xml:space="preserve">. París: OECD Publishing.</w:t>
       </w:r>
     </w:p>
-    <w:bookmarkEnd w:id="100"/>
-    <w:bookmarkEnd w:id="101"/>
-    <w:bookmarkStart w:id="110" w:name="X014d18f4b4fc9f8a23b3910c21b8ec724e62a3b"/>
+    <w:bookmarkEnd w:id="102"/>
+    <w:bookmarkEnd w:id="103"/>
+    <w:bookmarkStart w:id="112" w:name="X014d18f4b4fc9f8a23b3910c21b8ec724e62a3b"/>
     <w:p>
       <w:pPr>
         <w:pStyle w:val="Heading1"/>
@@ -15287,7 +15311,7 @@
         <w:t xml:space="preserve">10. Matriz 10: Determinantes Microeconómicos de la Pobreza en Ayacucho</w:t>
       </w:r>
     </w:p>
-    <w:bookmarkStart w:id="102" w:name="título-9"/>
+    <w:bookmarkStart w:id="104" w:name="título-9"/>
     <w:p>
       <w:pPr>
         <w:pStyle w:val="Heading2"/>
@@ -15308,8 +15332,8 @@
         <w:t xml:space="preserve">Determinantes Microeconómicos de la Pobreza en el Departamento de Ayacucho, Periodo 2000-2020</w:t>
       </w:r>
     </w:p>
-    <w:bookmarkEnd w:id="102"/>
-    <w:bookmarkStart w:id="103" w:name="datos-generales-9"/>
+    <w:bookmarkEnd w:id="104"/>
+    <w:bookmarkStart w:id="105" w:name="datos-generales-9"/>
     <w:p>
       <w:pPr>
         <w:pStyle w:val="Heading2"/>
@@ -15691,8 +15715,8 @@
         </w:tc>
       </w:tr>
     </w:tbl>
-    <w:bookmarkEnd w:id="103"/>
-    <w:bookmarkStart w:id="104" w:name="variables-e-indicadores-9"/>
+    <w:bookmarkEnd w:id="105"/>
+    <w:bookmarkStart w:id="106" w:name="variables-e-indicadores-9"/>
     <w:p>
       <w:pPr>
         <w:pStyle w:val="Heading2"/>
@@ -16314,8 +16338,8 @@
         </w:tc>
       </w:tr>
     </w:tbl>
-    <w:bookmarkEnd w:id="104"/>
-    <w:bookmarkStart w:id="105" w:name="metodología-9"/>
+    <w:bookmarkEnd w:id="106"/>
+    <w:bookmarkStart w:id="107" w:name="metodología-9"/>
     <w:p>
       <w:pPr>
         <w:pStyle w:val="Heading2"/>
@@ -16732,8 +16756,8 @@
         </w:tc>
       </w:tr>
     </w:tbl>
-    <w:bookmarkEnd w:id="105"/>
-    <w:bookmarkStart w:id="106" w:name="marco-teórico-conceptos-clave-9"/>
+    <w:bookmarkEnd w:id="107"/>
+    <w:bookmarkStart w:id="108" w:name="marco-teórico-conceptos-clave-9"/>
     <w:p>
       <w:pPr>
         <w:pStyle w:val="Heading2"/>
@@ -16814,8 +16838,8 @@
         <w:t xml:space="preserve">Cambio en la probabilidad predicha ante un cambio marginal en una variable explicativa, manteniendo constantes las demás variables.</w:t>
       </w:r>
     </w:p>
-    <w:bookmarkEnd w:id="106"/>
-    <w:bookmarkStart w:id="107" w:name="modelo-econométrico-propuesto-2"/>
+    <w:bookmarkEnd w:id="108"/>
+    <w:bookmarkStart w:id="109" w:name="modelo-econométrico-propuesto-2"/>
     <w:p>
       <w:pPr>
         <w:pStyle w:val="Heading2"/>
@@ -16848,49 +16872,36 @@
           <m:r>
             <m:t>P</m:t>
           </m:r>
-          <m:d>
-            <m:dPr>
-              <m:begChr m:val="("/>
-              <m:sepChr m:val=""/>
-              <m:endChr m:val=")"/>
-              <m:grow/>
-            </m:dPr>
+          <m:r>
+            <m:rPr>
+              <m:sty m:val="p"/>
+            </m:rPr>
+            <m:t>(</m:t>
+          </m:r>
+          <m:r>
+            <m:t>P</m:t>
+          </m:r>
+          <m:r>
+            <m:t>o</m:t>
+          </m:r>
+          <m:r>
+            <m:t>b</m:t>
+          </m:r>
+          <m:r>
+            <m:t>r</m:t>
+          </m:r>
+          <m:sSub>
             <m:e>
               <m:r>
-                <m:t>P</m:t>
-              </m:r>
-              <m:r>
-                <m:t>o</m:t>
-              </m:r>
-              <m:r>
-                <m:t>b</m:t>
-              </m:r>
-              <m:r>
-                <m:t>r</m:t>
-              </m:r>
-              <m:sSub>
-                <m:e>
-                  <m:r>
-                    <m:t>e</m:t>
-                  </m:r>
-                </m:e>
-                <m:sub>
-                  <m:r>
-                    <m:t>i</m:t>
-                  </m:r>
-                </m:sub>
-              </m:sSub>
-              <m:r>
-                <m:rPr>
-                  <m:sty m:val="p"/>
-                </m:rPr>
-                <m:t>=</m:t>
-              </m:r>
-              <m:r>
-                <m:t>1</m:t>
+                <m:t>e</m:t>
               </m:r>
             </m:e>
-          </m:d>
+            <m:sub>
+              <m:r>
+                <m:t>i</m:t>
+              </m:r>
+            </m:sub>
+          </m:sSub>
           <m:r>
             <m:rPr>
               <m:sty m:val="p"/>
@@ -16898,384 +16909,404 @@
             <m:t>=</m:t>
           </m:r>
           <m:r>
+            <m:t>1</m:t>
+          </m:r>
+          <m:r>
+            <m:rPr>
+              <m:sty m:val="p"/>
+            </m:rPr>
+            <m:t>)</m:t>
+          </m:r>
+          <m:r>
+            <m:rPr>
+              <m:sty m:val="p"/>
+            </m:rPr>
+            <m:t>=</m:t>
+          </m:r>
+          <m:r>
+            <m:rPr>
+              <m:sty m:val="p"/>
+            </m:rPr>
             <m:t>Λ</m:t>
           </m:r>
-          <m:d>
-            <m:dPr>
-              <m:begChr m:val="("/>
-              <m:sepChr m:val=""/>
-              <m:endChr m:val=")"/>
-              <m:grow/>
-            </m:dPr>
+          <m:r>
+            <m:rPr>
+              <m:sty m:val="p"/>
+            </m:rPr>
+            <m:t>(</m:t>
+          </m:r>
+          <m:r>
+            <m:t>β</m:t>
+          </m:r>
+          <m:r>
+            <m:rPr>
+              <m:sty m:val="p"/>
+            </m:rPr>
+            <m:t>₀</m:t>
+          </m:r>
+          <m:r>
+            <m:rPr>
+              <m:sty m:val="p"/>
+            </m:rPr>
+            <m:t>+</m:t>
+          </m:r>
+          <m:r>
+            <m:t>β</m:t>
+          </m:r>
+          <m:r>
+            <m:rPr>
+              <m:sty m:val="p"/>
+            </m:rPr>
+            <m:t>₁</m:t>
+          </m:r>
+          <m:r>
+            <m:rPr>
+              <m:sty m:val="p"/>
+            </m:rPr>
+            <m:t>·</m:t>
+          </m:r>
+          <m:r>
+            <m:t>E</m:t>
+          </m:r>
+          <m:r>
+            <m:t>d</m:t>
+          </m:r>
+          <m:r>
+            <m:t>a</m:t>
+          </m:r>
+          <m:sSub>
             <m:e>
-              <m:r>
-                <m:t>β</m:t>
-              </m:r>
-              <m:r>
-                <m:rPr>
-                  <m:sty m:val="p"/>
-                </m:rPr>
-                <m:t>₀</m:t>
-              </m:r>
-              <m:r>
-                <m:rPr>
-                  <m:sty m:val="p"/>
-                </m:rPr>
-                <m:t>+</m:t>
-              </m:r>
-              <m:r>
-                <m:t>β</m:t>
-              </m:r>
-              <m:r>
-                <m:rPr>
-                  <m:sty m:val="p"/>
-                </m:rPr>
-                <m:t>₁</m:t>
-              </m:r>
-              <m:r>
-                <m:rPr>
-                  <m:sty m:val="p"/>
-                </m:rPr>
-                <m:t>·</m:t>
-              </m:r>
-              <m:r>
-                <m:t>E</m:t>
-              </m:r>
               <m:r>
                 <m:t>d</m:t>
               </m:r>
+            </m:e>
+            <m:sub>
+              <m:r>
+                <m:t>i</m:t>
+              </m:r>
+            </m:sub>
+          </m:sSub>
+          <m:r>
+            <m:rPr>
+              <m:sty m:val="p"/>
+            </m:rPr>
+            <m:t>+</m:t>
+          </m:r>
+          <m:r>
+            <m:t>β</m:t>
+          </m:r>
+          <m:r>
+            <m:rPr>
+              <m:sty m:val="p"/>
+            </m:rPr>
+            <m:t>₂</m:t>
+          </m:r>
+          <m:r>
+            <m:rPr>
+              <m:sty m:val="p"/>
+            </m:rPr>
+            <m:t>·</m:t>
+          </m:r>
+          <m:r>
+            <m:t>E</m:t>
+          </m:r>
+          <m:r>
+            <m:t>d</m:t>
+          </m:r>
+          <m:r>
+            <m:t>u</m:t>
+          </m:r>
+          <m:r>
+            <m:t>c</m:t>
+          </m:r>
+          <m:r>
+            <m:t>a</m:t>
+          </m:r>
+          <m:r>
+            <m:t>c</m:t>
+          </m:r>
+          <m:r>
+            <m:t>i</m:t>
+          </m:r>
+          <m:r>
+            <m:t>ó</m:t>
+          </m:r>
+          <m:sSub>
+            <m:e>
+              <m:r>
+                <m:t>n</m:t>
+              </m:r>
+            </m:e>
+            <m:sub>
+              <m:r>
+                <m:t>i</m:t>
+              </m:r>
+            </m:sub>
+          </m:sSub>
+          <m:r>
+            <m:rPr>
+              <m:sty m:val="p"/>
+            </m:rPr>
+            <m:t>+</m:t>
+          </m:r>
+          <m:r>
+            <m:t>β</m:t>
+          </m:r>
+          <m:r>
+            <m:rPr>
+              <m:sty m:val="p"/>
+            </m:rPr>
+            <m:t>₃</m:t>
+          </m:r>
+          <m:r>
+            <m:rPr>
+              <m:sty m:val="p"/>
+            </m:rPr>
+            <m:t>·</m:t>
+          </m:r>
+          <m:r>
+            <m:t>T</m:t>
+          </m:r>
+          <m:r>
+            <m:t>a</m:t>
+          </m:r>
+          <m:r>
+            <m:t>m</m:t>
+          </m:r>
+          <m:r>
+            <m:t>a</m:t>
+          </m:r>
+          <m:r>
+            <m:t>ñ</m:t>
+          </m:r>
+          <m:r>
+            <m:t>o</m:t>
+          </m:r>
+          <m:r>
+            <m:t>H</m:t>
+          </m:r>
+          <m:r>
+            <m:t>o</m:t>
+          </m:r>
+          <m:r>
+            <m:t>g</m:t>
+          </m:r>
+          <m:r>
+            <m:t>a</m:t>
+          </m:r>
+          <m:sSub>
+            <m:e>
+              <m:r>
+                <m:t>r</m:t>
+              </m:r>
+            </m:e>
+            <m:sub>
+              <m:r>
+                <m:t>i</m:t>
+              </m:r>
+            </m:sub>
+          </m:sSub>
+          <m:r>
+            <m:rPr>
+              <m:sty m:val="p"/>
+            </m:rPr>
+            <m:t>+</m:t>
+          </m:r>
+          <m:r>
+            <m:t>β</m:t>
+          </m:r>
+          <m:r>
+            <m:rPr>
+              <m:sty m:val="p"/>
+            </m:rPr>
+            <m:t>₄</m:t>
+          </m:r>
+          <m:r>
+            <m:rPr>
+              <m:sty m:val="p"/>
+            </m:rPr>
+            <m:t>·</m:t>
+          </m:r>
+          <m:r>
+            <m:t>R</m:t>
+          </m:r>
+          <m:r>
+            <m:t>a</m:t>
+          </m:r>
+          <m:r>
+            <m:t>m</m:t>
+          </m:r>
+          <m:r>
+            <m:t>a</m:t>
+          </m:r>
+          <m:r>
+            <m:t>A</m:t>
+          </m:r>
+          <m:r>
+            <m:t>c</m:t>
+          </m:r>
+          <m:r>
+            <m:t>t</m:t>
+          </m:r>
+          <m:r>
+            <m:t>i</m:t>
+          </m:r>
+          <m:r>
+            <m:t>v</m:t>
+          </m:r>
+          <m:r>
+            <m:t>i</m:t>
+          </m:r>
+          <m:r>
+            <m:t>d</m:t>
+          </m:r>
+          <m:r>
+            <m:t>a</m:t>
+          </m:r>
+          <m:sSub>
+            <m:e>
+              <m:r>
+                <m:t>d</m:t>
+              </m:r>
+            </m:e>
+            <m:sub>
+              <m:r>
+                <m:t>i</m:t>
+              </m:r>
+            </m:sub>
+          </m:sSub>
+          <m:r>
+            <m:rPr>
+              <m:sty m:val="p"/>
+            </m:rPr>
+            <m:t>+</m:t>
+          </m:r>
+          <m:r>
+            <m:t>β</m:t>
+          </m:r>
+          <m:r>
+            <m:rPr>
+              <m:sty m:val="p"/>
+            </m:rPr>
+            <m:t>₅</m:t>
+          </m:r>
+          <m:r>
+            <m:rPr>
+              <m:sty m:val="p"/>
+            </m:rPr>
+            <m:t>·</m:t>
+          </m:r>
+          <m:r>
+            <m:t>I</m:t>
+          </m:r>
+          <m:r>
+            <m:t>n</m:t>
+          </m:r>
+          <m:r>
+            <m:t>f</m:t>
+          </m:r>
+          <m:r>
+            <m:t>o</m:t>
+          </m:r>
+          <m:r>
+            <m:t>r</m:t>
+          </m:r>
+          <m:r>
+            <m:t>m</m:t>
+          </m:r>
+          <m:r>
+            <m:t>a</m:t>
+          </m:r>
+          <m:r>
+            <m:t>l</m:t>
+          </m:r>
+          <m:r>
+            <m:t>i</m:t>
+          </m:r>
+          <m:r>
+            <m:t>d</m:t>
+          </m:r>
+          <m:r>
+            <m:t>a</m:t>
+          </m:r>
+          <m:sSub>
+            <m:e>
+              <m:r>
+                <m:t>d</m:t>
+              </m:r>
+            </m:e>
+            <m:sub>
+              <m:r>
+                <m:t>i</m:t>
+              </m:r>
+            </m:sub>
+          </m:sSub>
+          <m:r>
+            <m:rPr>
+              <m:sty m:val="p"/>
+            </m:rPr>
+            <m:t>+</m:t>
+          </m:r>
+          <m:r>
+            <m:t>β</m:t>
+          </m:r>
+          <m:r>
+            <m:rPr>
+              <m:sty m:val="p"/>
+            </m:rPr>
+            <m:t>₆</m:t>
+          </m:r>
+          <m:r>
+            <m:rPr>
+              <m:sty m:val="p"/>
+            </m:rPr>
+            <m:t>·</m:t>
+          </m:r>
+          <m:r>
+            <m:t>Á</m:t>
+          </m:r>
+          <m:r>
+            <m:t>r</m:t>
+          </m:r>
+          <m:r>
+            <m:t>e</m:t>
+          </m:r>
+          <m:sSub>
+            <m:e>
               <m:r>
                 <m:t>a</m:t>
               </m:r>
-              <m:sSub>
-                <m:e>
-                  <m:r>
-                    <m:t>d</m:t>
-                  </m:r>
-                </m:e>
-                <m:sub>
-                  <m:r>
-                    <m:t>i</m:t>
-                  </m:r>
-                </m:sub>
-              </m:sSub>
-              <m:r>
-                <m:rPr>
-                  <m:sty m:val="p"/>
-                </m:rPr>
-                <m:t>+</m:t>
-              </m:r>
-              <m:r>
-                <m:t>β</m:t>
-              </m:r>
-              <m:r>
-                <m:rPr>
-                  <m:sty m:val="p"/>
-                </m:rPr>
-                <m:t>₂</m:t>
-              </m:r>
-              <m:r>
-                <m:rPr>
-                  <m:sty m:val="p"/>
-                </m:rPr>
-                <m:t>·</m:t>
-              </m:r>
-              <m:r>
-                <m:t>E</m:t>
-              </m:r>
-              <m:r>
-                <m:t>d</m:t>
-              </m:r>
-              <m:r>
-                <m:t>u</m:t>
-              </m:r>
-              <m:r>
-                <m:t>c</m:t>
-              </m:r>
-              <m:r>
-                <m:t>a</m:t>
-              </m:r>
-              <m:r>
-                <m:t>c</m:t>
-              </m:r>
+            </m:e>
+            <m:sub>
               <m:r>
                 <m:t>i</m:t>
               </m:r>
+            </m:sub>
+          </m:sSub>
+          <m:r>
+            <m:rPr>
+              <m:sty m:val="p"/>
+            </m:rPr>
+            <m:t>+</m:t>
+          </m:r>
+          <m:sSub>
+            <m:e>
               <m:r>
-                <m:t>ó</m:t>
+                <m:t>ε</m:t>
               </m:r>
-              <m:sSub>
-                <m:e>
-                  <m:r>
-                    <m:t>n</m:t>
-                  </m:r>
-                </m:e>
-                <m:sub>
-                  <m:r>
-                    <m:t>i</m:t>
-                  </m:r>
-                </m:sub>
-              </m:sSub>
-              <m:r>
-                <m:rPr>
-                  <m:sty m:val="p"/>
-                </m:rPr>
-                <m:t>+</m:t>
-              </m:r>
-              <m:r>
-                <m:t>β</m:t>
-              </m:r>
-              <m:r>
-                <m:rPr>
-                  <m:sty m:val="p"/>
-                </m:rPr>
-                <m:t>₃</m:t>
-              </m:r>
-              <m:r>
-                <m:rPr>
-                  <m:sty m:val="p"/>
-                </m:rPr>
-                <m:t>·</m:t>
-              </m:r>
-              <m:r>
-                <m:t>T</m:t>
-              </m:r>
-              <m:r>
-                <m:t>a</m:t>
-              </m:r>
-              <m:r>
-                <m:t>m</m:t>
-              </m:r>
-              <m:r>
-                <m:t>a</m:t>
-              </m:r>
-              <m:r>
-                <m:t>ñ</m:t>
-              </m:r>
-              <m:r>
-                <m:t>o</m:t>
-              </m:r>
-              <m:r>
-                <m:t>H</m:t>
-              </m:r>
-              <m:r>
-                <m:t>o</m:t>
-              </m:r>
-              <m:r>
-                <m:t>g</m:t>
-              </m:r>
-              <m:r>
-                <m:t>a</m:t>
-              </m:r>
-              <m:sSub>
-                <m:e>
-                  <m:r>
-                    <m:t>r</m:t>
-                  </m:r>
-                </m:e>
-                <m:sub>
-                  <m:r>
-                    <m:t>i</m:t>
-                  </m:r>
-                </m:sub>
-              </m:sSub>
-              <m:r>
-                <m:rPr>
-                  <m:sty m:val="p"/>
-                </m:rPr>
-                <m:t>+</m:t>
-              </m:r>
-              <m:r>
-                <m:t>β</m:t>
-              </m:r>
-              <m:r>
-                <m:rPr>
-                  <m:sty m:val="p"/>
-                </m:rPr>
-                <m:t>₄</m:t>
-              </m:r>
-              <m:r>
-                <m:rPr>
-                  <m:sty m:val="p"/>
-                </m:rPr>
-                <m:t>·</m:t>
-              </m:r>
-              <m:r>
-                <m:t>R</m:t>
-              </m:r>
-              <m:r>
-                <m:t>a</m:t>
-              </m:r>
-              <m:r>
-                <m:t>m</m:t>
-              </m:r>
-              <m:r>
-                <m:t>a</m:t>
-              </m:r>
-              <m:r>
-                <m:t>A</m:t>
-              </m:r>
-              <m:r>
-                <m:t>c</m:t>
-              </m:r>
-              <m:r>
-                <m:t>t</m:t>
-              </m:r>
+            </m:e>
+            <m:sub>
               <m:r>
                 <m:t>i</m:t>
               </m:r>
-              <m:r>
-                <m:t>v</m:t>
-              </m:r>
-              <m:r>
-                <m:t>i</m:t>
-              </m:r>
-              <m:r>
-                <m:t>d</m:t>
-              </m:r>
-              <m:r>
-                <m:t>a</m:t>
-              </m:r>
-              <m:sSub>
-                <m:e>
-                  <m:r>
-                    <m:t>d</m:t>
-                  </m:r>
-                </m:e>
-                <m:sub>
-                  <m:r>
-                    <m:t>i</m:t>
-                  </m:r>
-                </m:sub>
-              </m:sSub>
-              <m:r>
-                <m:rPr>
-                  <m:sty m:val="p"/>
-                </m:rPr>
-                <m:t>+</m:t>
-              </m:r>
-              <m:r>
-                <m:t>β</m:t>
-              </m:r>
-              <m:r>
-                <m:rPr>
-                  <m:sty m:val="p"/>
-                </m:rPr>
-                <m:t>₅</m:t>
-              </m:r>
-              <m:r>
-                <m:rPr>
-                  <m:sty m:val="p"/>
-                </m:rPr>
-                <m:t>·</m:t>
-              </m:r>
-              <m:r>
-                <m:t>I</m:t>
-              </m:r>
-              <m:r>
-                <m:t>n</m:t>
-              </m:r>
-              <m:r>
-                <m:t>f</m:t>
-              </m:r>
-              <m:r>
-                <m:t>o</m:t>
-              </m:r>
-              <m:r>
-                <m:t>r</m:t>
-              </m:r>
-              <m:r>
-                <m:t>m</m:t>
-              </m:r>
-              <m:r>
-                <m:t>a</m:t>
-              </m:r>
-              <m:r>
-                <m:t>l</m:t>
-              </m:r>
-              <m:r>
-                <m:t>i</m:t>
-              </m:r>
-              <m:r>
-                <m:t>d</m:t>
-              </m:r>
-              <m:r>
-                <m:t>a</m:t>
-              </m:r>
-              <m:sSub>
-                <m:e>
-                  <m:r>
-                    <m:t>d</m:t>
-                  </m:r>
-                </m:e>
-                <m:sub>
-                  <m:r>
-                    <m:t>i</m:t>
-                  </m:r>
-                </m:sub>
-              </m:sSub>
-              <m:r>
-                <m:rPr>
-                  <m:sty m:val="p"/>
-                </m:rPr>
-                <m:t>+</m:t>
-              </m:r>
-              <m:r>
-                <m:t>β</m:t>
-              </m:r>
-              <m:r>
-                <m:rPr>
-                  <m:sty m:val="p"/>
-                </m:rPr>
-                <m:t>₆</m:t>
-              </m:r>
-              <m:r>
-                <m:rPr>
-                  <m:sty m:val="p"/>
-                </m:rPr>
-                <m:t>·</m:t>
-              </m:r>
-              <m:r>
-                <m:t>Á</m:t>
-              </m:r>
-              <m:r>
-                <m:t>r</m:t>
-              </m:r>
-              <m:r>
-                <m:t>e</m:t>
-              </m:r>
-              <m:sSub>
-                <m:e>
-                  <m:r>
-                    <m:t>a</m:t>
-                  </m:r>
-                </m:e>
-                <m:sub>
-                  <m:r>
-                    <m:t>i</m:t>
-                  </m:r>
-                </m:sub>
-              </m:sSub>
-              <m:r>
-                <m:rPr>
-                  <m:sty m:val="p"/>
-                </m:rPr>
-                <m:t>+</m:t>
-              </m:r>
-              <m:sSub>
-                <m:e>
-                  <m:r>
-                    <m:t>ε</m:t>
-                  </m:r>
-                </m:e>
-                <m:sub>
-                  <m:r>
-                    <m:t>i</m:t>
-                  </m:r>
-                </m:sub>
-              </m:sSub>
-            </m:e>
-          </m:d>
+            </m:sub>
+          </m:sSub>
+          <m:r>
+            <m:rPr>
+              <m:sty m:val="p"/>
+            </m:rPr>
+            <m:t>)</m:t>
+          </m:r>
         </m:oMath>
       </m:oMathPara>
     </w:p>
@@ -17371,8 +17402,8 @@
         <w:t xml:space="preserve">Efectos marginales: Cambio en probabilidad ante cambio unitario en X</w:t>
       </w:r>
     </w:p>
-    <w:bookmarkEnd w:id="107"/>
-    <w:bookmarkStart w:id="108" w:name="hipótesis-de-signo-esperado"/>
+    <w:bookmarkEnd w:id="109"/>
+    <w:bookmarkStart w:id="110" w:name="hipótesis-de-signo-esperado"/>
     <w:p>
       <w:pPr>
         <w:pStyle w:val="Heading2"/>
@@ -17453,8 +17484,8 @@
         <w:t xml:space="preserve">Área urbana: Negativo (urbano → ↓ pobreza)</w:t>
       </w:r>
     </w:p>
-    <w:bookmarkEnd w:id="108"/>
-    <w:bookmarkStart w:id="109" w:name="referencias-principales-9"/>
+    <w:bookmarkEnd w:id="110"/>
+    <w:bookmarkStart w:id="111" w:name="referencias-principales-9"/>
     <w:p>
       <w:pPr>
         <w:pStyle w:val="Heading2"/>
@@ -17541,9 +17572,9 @@
         <w:t xml:space="preserve">. The Economic Journal, 106(438), 1328-1343.</w:t>
       </w:r>
     </w:p>
-    <w:bookmarkEnd w:id="109"/>
-    <w:bookmarkEnd w:id="110"/>
-    <w:bookmarkStart w:id="114" w:name="X02cdc375e12d4a31ae80bb1df08f46cf6ff106d"/>
+    <w:bookmarkEnd w:id="111"/>
+    <w:bookmarkEnd w:id="112"/>
+    <w:bookmarkStart w:id="116" w:name="X02cdc375e12d4a31ae80bb1df08f46cf6ff106d"/>
     <w:p>
       <w:pPr>
         <w:pStyle w:val="Heading1"/>
@@ -17552,7 +17583,7 @@
         <w:t xml:space="preserve">11. Matriz 11: Factores de Desnutrición Infantil</w:t>
       </w:r>
     </w:p>
-    <w:bookmarkStart w:id="111" w:name="título-10"/>
+    <w:bookmarkStart w:id="113" w:name="título-10"/>
     <w:p>
       <w:pPr>
         <w:pStyle w:val="Heading2"/>
@@ -17696,8 +17727,8 @@
         </w:tc>
       </w:tr>
     </w:tbl>
-    <w:bookmarkEnd w:id="111"/>
-    <w:bookmarkStart w:id="112" w:name="operacionalización-de-variables"/>
+    <w:bookmarkEnd w:id="113"/>
+    <w:bookmarkStart w:id="114" w:name="operacionalización-de-variables"/>
     <w:p>
       <w:pPr>
         <w:pStyle w:val="Heading2"/>
@@ -17969,8 +18000,8 @@
         </w:tc>
       </w:tr>
     </w:tbl>
-    <w:bookmarkEnd w:id="112"/>
-    <w:bookmarkStart w:id="113" w:name="metodología-10"/>
+    <w:bookmarkEnd w:id="114"/>
+    <w:bookmarkStart w:id="115" w:name="metodología-10"/>
     <w:p>
       <w:pPr>
         <w:pStyle w:val="Heading2"/>
@@ -18111,9 +18142,9 @@
         <w:t xml:space="preserve">SPSS, Stata</w:t>
       </w:r>
     </w:p>
-    <w:bookmarkEnd w:id="113"/>
-    <w:bookmarkEnd w:id="114"/>
-    <w:bookmarkStart w:id="118" w:name="Xd16c027590d3d0bbaac5a4dfa6e63143b96e1e9"/>
+    <w:bookmarkEnd w:id="115"/>
+    <w:bookmarkEnd w:id="116"/>
+    <w:bookmarkStart w:id="120" w:name="Xd16c027590d3d0bbaac5a4dfa6e63143b96e1e9"/>
     <w:p>
       <w:pPr>
         <w:pStyle w:val="Heading1"/>
@@ -18122,7 +18153,7 @@
         <w:t xml:space="preserve">12. Matriz 12: Recaudación de Impuestos Prediales</w:t>
       </w:r>
     </w:p>
-    <w:bookmarkStart w:id="115" w:name="título-11"/>
+    <w:bookmarkStart w:id="117" w:name="título-11"/>
     <w:p>
       <w:pPr>
         <w:pStyle w:val="Heading2"/>
@@ -18266,8 +18297,8 @@
         </w:tc>
       </w:tr>
     </w:tbl>
-    <w:bookmarkEnd w:id="115"/>
-    <w:bookmarkStart w:id="116" w:name="operacionalización-de-variables-1"/>
+    <w:bookmarkEnd w:id="117"/>
+    <w:bookmarkStart w:id="118" w:name="operacionalización-de-variables-1"/>
     <w:p>
       <w:pPr>
         <w:pStyle w:val="Heading2"/>
@@ -18537,8 +18568,8 @@
         </w:tc>
       </w:tr>
     </w:tbl>
-    <w:bookmarkEnd w:id="116"/>
-    <w:bookmarkStart w:id="117" w:name="metodología-11"/>
+    <w:bookmarkEnd w:id="118"/>
+    <w:bookmarkStart w:id="119" w:name="metodología-11"/>
     <w:p>
       <w:pPr>
         <w:pStyle w:val="Heading2"/>
@@ -18679,9 +18710,9 @@
         <w:t xml:space="preserve">SPSS, Excel</w:t>
       </w:r>
     </w:p>
-    <w:bookmarkEnd w:id="117"/>
-    <w:bookmarkEnd w:id="118"/>
-    <w:bookmarkStart w:id="122" w:name="Xbebb1e3380693457188bca6eca2d865be0bd69c"/>
+    <w:bookmarkEnd w:id="119"/>
+    <w:bookmarkEnd w:id="120"/>
+    <w:bookmarkStart w:id="124" w:name="Xbebb1e3380693457188bca6eca2d865be0bd69c"/>
     <w:p>
       <w:pPr>
         <w:pStyle w:val="Heading1"/>
@@ -18690,7 +18721,7 @@
         <w:t xml:space="preserve">13. Matriz 13: Choques Externos e Ingresos Tributarios</w:t>
       </w:r>
     </w:p>
-    <w:bookmarkStart w:id="119" w:name="título-12"/>
+    <w:bookmarkStart w:id="121" w:name="título-12"/>
     <w:p>
       <w:pPr>
         <w:pStyle w:val="Heading2"/>
@@ -18834,8 +18865,8 @@
         </w:tc>
       </w:tr>
     </w:tbl>
-    <w:bookmarkEnd w:id="119"/>
-    <w:bookmarkStart w:id="120" w:name="operacionalización-de-variables-2"/>
+    <w:bookmarkEnd w:id="121"/>
+    <w:bookmarkStart w:id="122" w:name="operacionalización-de-variables-2"/>
     <w:p>
       <w:pPr>
         <w:pStyle w:val="Heading2"/>
@@ -19060,8 +19091,8 @@
         </w:tc>
       </w:tr>
     </w:tbl>
-    <w:bookmarkEnd w:id="120"/>
-    <w:bookmarkStart w:id="121" w:name="metodología-12"/>
+    <w:bookmarkEnd w:id="122"/>
+    <w:bookmarkStart w:id="123" w:name="metodología-12"/>
     <w:p>
       <w:pPr>
         <w:pStyle w:val="Heading2"/>
@@ -19180,9 +19211,9 @@
         <w:t xml:space="preserve">EViews, Stata, R</w:t>
       </w:r>
     </w:p>
-    <w:bookmarkEnd w:id="121"/>
-    <w:bookmarkEnd w:id="122"/>
-    <w:bookmarkStart w:id="125" w:name="fuentes-de-datos"/>
+    <w:bookmarkEnd w:id="123"/>
+    <w:bookmarkEnd w:id="124"/>
+    <w:bookmarkStart w:id="127" w:name="fuentes-de-datos"/>
     <w:p>
       <w:pPr>
         <w:pStyle w:val="Heading1"/>
@@ -19191,7 +19222,7 @@
         <w:t xml:space="preserve">14. Fuentes de Datos</w:t>
       </w:r>
     </w:p>
-    <w:bookmarkStart w:id="123" w:name="instituciones-nacionales"/>
+    <w:bookmarkStart w:id="125" w:name="instituciones-nacionales"/>
     <w:p>
       <w:pPr>
         <w:pStyle w:val="Heading2"/>
@@ -19354,8 +19385,8 @@
         <w:t xml:space="preserve">Indicadores de salud</w:t>
       </w:r>
     </w:p>
-    <w:bookmarkEnd w:id="123"/>
-    <w:bookmarkStart w:id="124" w:name="instituciones-internacionales"/>
+    <w:bookmarkEnd w:id="125"/>
+    <w:bookmarkStart w:id="126" w:name="instituciones-internacionales"/>
     <w:p>
       <w:pPr>
         <w:pStyle w:val="Heading2"/>
@@ -19430,9 +19461,9 @@
         <w:t xml:space="preserve">Indicadores de desarrollo</w:t>
       </w:r>
     </w:p>
-    <w:bookmarkEnd w:id="124"/>
-    <w:bookmarkEnd w:id="125"/>
-    <w:bookmarkStart w:id="126" w:name="referencias"/>
+    <w:bookmarkEnd w:id="126"/>
+    <w:bookmarkEnd w:id="127"/>
+    <w:bookmarkStart w:id="128" w:name="referencias"/>
     <w:p>
       <w:pPr>
         <w:pStyle w:val="Heading1"/>
@@ -19630,7 +19661,7 @@
         <w:br w:type="page"/>
       </w:r>
     </w:p>
-    <w:bookmarkEnd w:id="126"/>
+    <w:bookmarkEnd w:id="128"/>
     <w:p>
       <w:pPr>
         <w:pStyle w:val="Heading1"/>
@@ -19639,7 +19670,7 @@
         <w:t xml:space="preserve">16. Anexo</w:t>
       </w:r>
     </w:p>
-    <w:bookmarkStart w:id="137" w:name="apx-publicaciones-similares"/>
+    <w:bookmarkStart w:id="143" w:name="apx-publicaciones-similares"/>
     <w:p>
       <w:pPr>
         <w:pStyle w:val="Heading1"/>
@@ -19664,11 +19695,11 @@
           <w:numId w:val="1048"/>
         </w:numPr>
       </w:pPr>
-      <w:hyperlink r:id="rId127"/>
+      <w:hyperlink r:id="rId129"/>
       <w:r>
         <w:t xml:space="preserve"> </w:t>
       </w:r>
-      <w:hyperlink r:id="rId128">
+      <w:hyperlink r:id="rId130">
         <w:r>
           <w:rPr>
             <w:rStyle w:val="Hyperlink"/>
@@ -19685,11 +19716,11 @@
           <w:numId w:val="1048"/>
         </w:numPr>
       </w:pPr>
-      <w:hyperlink r:id="rId129"/>
+      <w:hyperlink r:id="rId131"/>
       <w:r>
         <w:t xml:space="preserve"> </w:t>
       </w:r>
-      <w:hyperlink r:id="rId130">
+      <w:hyperlink r:id="rId132">
         <w:r>
           <w:rPr>
             <w:rStyle w:val="Hyperlink"/>
@@ -19706,11 +19737,11 @@
           <w:numId w:val="1048"/>
         </w:numPr>
       </w:pPr>
-      <w:hyperlink r:id="rId131"/>
+      <w:hyperlink r:id="rId133"/>
       <w:r>
         <w:t xml:space="preserve"> </w:t>
       </w:r>
-      <w:hyperlink r:id="rId132">
+      <w:hyperlink r:id="rId134">
         <w:r>
           <w:rPr>
             <w:rStyle w:val="Hyperlink"/>
@@ -19727,11 +19758,11 @@
           <w:numId w:val="1048"/>
         </w:numPr>
       </w:pPr>
-      <w:hyperlink r:id="rId133"/>
+      <w:hyperlink r:id="rId135"/>
       <w:r>
         <w:t xml:space="preserve"> </w:t>
       </w:r>
-      <w:hyperlink r:id="rId134">
+      <w:hyperlink r:id="rId136">
         <w:r>
           <w:rPr>
             <w:rStyle w:val="Hyperlink"/>
@@ -19748,11 +19779,11 @@
           <w:numId w:val="1048"/>
         </w:numPr>
       </w:pPr>
-      <w:hyperlink r:id="rId135"/>
+      <w:hyperlink r:id="rId137"/>
       <w:r>
         <w:t xml:space="preserve"> </w:t>
       </w:r>
-      <w:hyperlink r:id="rId136">
+      <w:hyperlink r:id="rId138">
         <w:r>
           <w:rPr>
             <w:rStyle w:val="Hyperlink"/>
@@ -19763,20 +19794,62 @@
     </w:p>
     <w:p>
       <w:pPr>
+        <w:pStyle w:val="Compact"/>
+        <w:numPr>
+          <w:ilvl w:val="0"/>
+          <w:numId w:val="1048"/>
+        </w:numPr>
+      </w:pPr>
+      <w:hyperlink r:id="rId139"/>
+      <w:r>
+        <w:t xml:space="preserve"> </w:t>
+      </w:r>
+      <w:hyperlink r:id="rId140">
+        <w:r>
+          <w:rPr>
+            <w:rStyle w:val="Hyperlink"/>
+          </w:rPr>
+          <w:t xml:space="preserve">Configuracion De Quarto Yml</w:t>
+        </w:r>
+      </w:hyperlink>
+    </w:p>
+    <w:p>
+      <w:pPr>
+        <w:pStyle w:val="Compact"/>
+        <w:numPr>
+          <w:ilvl w:val="0"/>
+          <w:numId w:val="1048"/>
+        </w:numPr>
+      </w:pPr>
+      <w:hyperlink r:id="rId141"/>
+      <w:r>
+        <w:t xml:space="preserve"> </w:t>
+      </w:r>
+      <w:hyperlink r:id="rId142">
+        <w:r>
+          <w:rPr>
+            <w:rStyle w:val="Hyperlink"/>
+          </w:rPr>
+          <w:t xml:space="preserve">Guia Practica De Metadata En Quarto</w:t>
+        </w:r>
+      </w:hyperlink>
+    </w:p>
+    <w:p>
+      <w:pPr>
         <w:pStyle w:val="FirstParagraph"/>
       </w:pPr>
       <w:r>
         <w:t xml:space="preserve">Esperamos que encuentres estas publicaciones igualmente interesantes y útiles. ¡Disfruta de la lectura!</w:t>
       </w:r>
     </w:p>
-    <w:bookmarkEnd w:id="137"/>
+    <w:bookmarkEnd w:id="143"/>
     <w:sectPr>
-      <w:headerReference r:id="rId9" w:type="even"/>
-      <w:headerReference r:id="rId11" w:type="default"/>
-      <w:footerReference r:id="rId14" w:type="even"/>
-      <w:footerReference r:id="rId13" w:type="default"/>
-      <w:headerReference r:id="rId10" w:type="first"/>
-      <w:footerReference r:id="rId12" w:type="first"/>
+      <w:headerReference r:id="rId8" w:type="even"/>
+      <w:headerReference r:id="rId9" w:type="default"/>
+      <w:footerReference r:id="rId10" w:type="even"/>
+      <w:footerReference r:id="rId11" w:type="default"/>
+      <w:headerReference r:id="rId12" w:type="first"/>
+      <w:footerReference r:id="rId13" w:type="first"/>
       <w:pgSz w:h="15840" w:w="12240"/>
       <w:pgMar w:bottom="1440" w:footer="720" w:gutter="0" w:header="720" w:left="1440" w:right="1440" w:top="1440"/>
       <w:cols w:space="720"/>

</xml_diff>